<commit_message>
"First Add to git"
</commit_message>
<xml_diff>
--- a/Dropbox/อบรมเชิงปฏิบัติการการใช้งาน Drop box.docx
+++ b/Dropbox/อบรมเชิงปฏิบัติการการใช้งาน Drop box.docx
@@ -1058,6 +1058,33 @@
           <w:szCs w:val="32"/>
         </w:rPr>
         <w:t>3</w:t>
+      </w:r>
+    </w:p>
+    <w:p>
+      <w:pPr>
+        <w:rPr>
+          <w:rFonts w:ascii="TH SarabunPSK" w:hAnsi="TH SarabunPSK" w:cs="TH SarabunPSK"/>
+          <w:sz w:val="32"/>
+          <w:szCs w:val="32"/>
+        </w:rPr>
+      </w:pPr>
+    </w:p>
+    <w:p>
+      <w:pPr>
+        <w:rPr>
+          <w:rFonts w:ascii="TH SarabunPSK" w:hAnsi="TH SarabunPSK" w:cs="TH SarabunPSK"/>
+          <w:sz w:val="32"/>
+          <w:szCs w:val="32"/>
+        </w:rPr>
+      </w:pPr>
+      <w:r>
+        <w:rPr>
+          <w:rFonts w:ascii="TH SarabunPSK" w:hAnsi="TH SarabunPSK" w:cs="TH SarabunPSK"/>
+          <w:sz w:val="32"/>
+          <w:szCs w:val="32"/>
+        </w:rPr>
+        <w:lastRenderedPageBreak/>
+        <w:t>TEST 4</w:t>
       </w:r>
     </w:p>
     <w:p>

</xml_diff>